<commit_message>
T5 docs (B3, F-11): remove performance claims from docs and prospectus
Removed alpha / hit-rate / "proven" claims and the self-graded "Expert
Assessment" line from README, ARCHITECTURE, ASSET_INVENTORY,
SALE_PROSPECTUS.md, the StockEdge partnership prospectus (md + docx,
regenerated from its script), the StockEdge thesis HTML, and both
make_*prospectus_docx.py generators. No replacement numbers; where a
figure stood, the text now says no performance is claimed.

Remaining T5 rg hits are justified: a disclaimer in the compliance
research doc, a third-party paper citation in the internal launch
playbook, a negation in generate_report.mjs, and a false positive.

Co-Authored-By: Claude Opus 5.5 <noreply@anthropic.com>
</commit_message>
<xml_diff>
--- a/docs/SALES PROSPECTUS/STOCKEDGE_PARTNERSHIP_PROSPECTUS.docx
+++ b/docs/SALES PROSPECTUS/STOCKEDGE_PARTNERSHIP_PROSPECTUS.docx
@@ -399,7 +399,7 @@
                 <w:color w:val="121A24"/>
                 <w:sz w:val="21"/>
               </w:rPr>
-              <w:t>Live platform  ·  v4.1.0  ·  13/13 smoke tests passing</w:t>
+              <w:t>Live platform  ·  v4.1.3  ·  15/15 smoke tests passing</w:t>
             </w:r>
           </w:p>
         </w:tc>
@@ -1875,7 +1875,7 @@
                 <w:color w:val="121A24"/>
                 <w:sz w:val="20"/>
               </w:rPr>
-              <w:t>neuralquant.onrender.com (FastAPI, v4.1.0)</w:t>
+              <w:t>neuralquant.onrender.com (FastAPI, v4.1.3)</w:t>
             </w:r>
           </w:p>
         </w:tc>
@@ -2039,7 +2039,7 @@
                 <w:color w:val="121A24"/>
                 <w:sz w:val="20"/>
               </w:rPr>
-              <w:t>7 (4 Render, 1 Vercel, 1 Railway, 1 Supabase)</w:t>
+              <w:t>7 (4 Render, 1 Vercel, 1 GCP, 1 Supabase)</w:t>
             </w:r>
           </w:p>
         </w:tc>
@@ -2315,7 +2315,7 @@
                 <w:color w:val="121A24"/>
                 <w:sz w:val="20"/>
               </w:rPr>
-              <w:t>148 backend tests passing, 13/13 live smoke suite</w:t>
+              <w:t>186 backend tests passing, 15/15 live smoke suite</w:t>
             </w:r>
           </w:p>
         </w:tc>
@@ -2729,7 +2729,7 @@
                 <w:color w:val="121A24"/>
                 <w:sz w:val="20"/>
               </w:rPr>
-              <w:t>Two live voice agents via LiveKit, Deepgram STT, ElevenLabs TTS, and Anthropic/Bedrock LLMs.</w:t>
+              <w:t>Two live voice agents via LiveKit, Deepgram STT, LiveKit Inference TTS, and Anthropic/Bedrock LLMs.</w:t>
             </w:r>
           </w:p>
         </w:tc>
@@ -2899,7 +2899,7 @@
                 <w:color w:val="121A24"/>
                 <w:sz w:val="20"/>
               </w:rPr>
-              <w:t>Q1 FY27 benchmark</w:t>
+              <w:t>Backtest performance</w:t>
             </w:r>
           </w:p>
         </w:tc>
@@ -2925,117 +2925,7 @@
                 <w:color w:val="121A24"/>
                 <w:sz w:val="20"/>
               </w:rPr>
-              <w:t>NIFTY50: −6.38%</w:t>
-            </w:r>
-          </w:p>
-        </w:tc>
-      </w:tr>
-      <w:tr>
-        <w:tc>
-          <w:tcPr>
-            <w:tcW w:type="dxa" w:w="3456"/>
-            <w:shd w:val="clear" w:color="auto" w:fill="EEF3F7"/>
-            <w:tcBorders>
-              <w:top w:val="single" w:sz="4" w:space="0" w:color="C7D2DC"/>
-              <w:left w:val="single" w:sz="4" w:space="0" w:color="C7D2DC"/>
-              <w:bottom w:val="single" w:sz="4" w:space="0" w:color="C7D2DC"/>
-              <w:right w:val="single" w:sz="4" w:space="0" w:color="C7D2DC"/>
-            </w:tcBorders>
-          </w:tcPr>
-          <w:p>
-            <w:pPr>
-              <w:spacing w:after="40" w:before="40"/>
-            </w:pPr>
-            <w:r>
-              <w:rPr>
-                <w:rFonts w:ascii="Calibri" w:hAnsi="Calibri"/>
-                <w:b w:val="0"/>
-                <w:i w:val="0"/>
-                <w:color w:val="121A24"/>
-                <w:sz w:val="20"/>
-              </w:rPr>
-              <w:t>Alpha vs NIFTY50</w:t>
-            </w:r>
-          </w:p>
-        </w:tc>
-        <w:tc>
-          <w:tcPr>
-            <w:tcW w:type="dxa" w:w="6048"/>
-            <w:shd w:val="clear" w:color="auto" w:fill="EEF3F7"/>
-            <w:tcBorders>
-              <w:top w:val="single" w:sz="4" w:space="0" w:color="C7D2DC"/>
-              <w:left w:val="single" w:sz="4" w:space="0" w:color="C7D2DC"/>
-              <w:bottom w:val="single" w:sz="4" w:space="0" w:color="C7D2DC"/>
-              <w:right w:val="single" w:sz="4" w:space="0" w:color="C7D2DC"/>
-            </w:tcBorders>
-          </w:tcPr>
-          <w:p>
-            <w:pPr>
-              <w:spacing w:after="40" w:before="40"/>
-            </w:pPr>
-            <w:r>
-              <w:rPr>
-                <w:rFonts w:ascii="Calibri" w:hAnsi="Calibri"/>
-                <w:b w:val="0"/>
-                <w:i w:val="0"/>
-                <w:color w:val="121A24"/>
-                <w:sz w:val="20"/>
-              </w:rPr>
-              <w:t>+12.69% to +14.83%</w:t>
-            </w:r>
-          </w:p>
-        </w:tc>
-      </w:tr>
-      <w:tr>
-        <w:tc>
-          <w:tcPr>
-            <w:tcW w:type="dxa" w:w="3456"/>
-            <w:tcBorders>
-              <w:top w:val="single" w:sz="4" w:space="0" w:color="C7D2DC"/>
-              <w:left w:val="single" w:sz="4" w:space="0" w:color="C7D2DC"/>
-              <w:bottom w:val="single" w:sz="4" w:space="0" w:color="C7D2DC"/>
-              <w:right w:val="single" w:sz="4" w:space="0" w:color="C7D2DC"/>
-            </w:tcBorders>
-          </w:tcPr>
-          <w:p>
-            <w:pPr>
-              <w:spacing w:after="40" w:before="40"/>
-            </w:pPr>
-            <w:r>
-              <w:rPr>
-                <w:rFonts w:ascii="Calibri" w:hAnsi="Calibri"/>
-                <w:b w:val="0"/>
-                <w:i w:val="0"/>
-                <w:color w:val="121A24"/>
-                <w:sz w:val="20"/>
-              </w:rPr>
-              <w:t>Hit rate</w:t>
-            </w:r>
-          </w:p>
-        </w:tc>
-        <w:tc>
-          <w:tcPr>
-            <w:tcW w:type="dxa" w:w="6048"/>
-            <w:tcBorders>
-              <w:top w:val="single" w:sz="4" w:space="0" w:color="C7D2DC"/>
-              <w:left w:val="single" w:sz="4" w:space="0" w:color="C7D2DC"/>
-              <w:bottom w:val="single" w:sz="4" w:space="0" w:color="C7D2DC"/>
-              <w:right w:val="single" w:sz="4" w:space="0" w:color="C7D2DC"/>
-            </w:tcBorders>
-          </w:tcPr>
-          <w:p>
-            <w:pPr>
-              <w:spacing w:after="40" w:before="40"/>
-            </w:pPr>
-            <w:r>
-              <w:rPr>
-                <w:rFonts w:ascii="Calibri" w:hAnsi="Calibri"/>
-                <w:b w:val="0"/>
-                <w:i w:val="0"/>
-                <w:color w:val="121A24"/>
-                <w:sz w:val="20"/>
-              </w:rPr>
-              <w:t>87–91%</w:t>
+              <w:t>Not claimed (no audited or reproducible result)</w:t>
             </w:r>
           </w:p>
         </w:tc>
@@ -3091,7 +2981,7 @@
                 <w:color w:val="121A24"/>
                 <w:sz w:val="20"/>
               </w:rPr>
-              <w:t>13/13 passing</w:t>
+              <w:t>15/15 passing</w:t>
             </w:r>
           </w:p>
         </w:tc>
@@ -5190,7 +5080,7 @@
         <w:t>Hi Vineet — long-time admirer of what you and Vivek have built at StockEdge.</w:t>
         <w:br/>
         <w:br/>
-        <w:t>We have built an adversarial AI research committee (PARA-DEBATE) that forces a bull-vs-bear debate before any stock conclusion — exactly the 'noise removal' StockEdge stands for. It is live with dual-market US+IN coverage, an India-specific IRS% score, and a Q1FY27 backtest showing +12.69% to +14.83% alpha vs NIFTY50.</w:t>
+        <w:t>We have built an adversarial AI research committee (PARA-DEBATE) that forces a bull-vs-bear debate before any stock conclusion — exactly the 'noise removal' StockEdge stands for. It is live with dual-market US+IN coverage, an India-specific IRS% score.</w:t>
         <w:br/>
         <w:br/>
         <w:t>I am not looking for a cash-heavy acquisition day one. I would love to explore a 12-month pilot inside StockEdge Pro that converts your 4M users into AI-tier subscribers, with an option to buy the IP later.</w:t>
@@ -5238,7 +5128,7 @@
         <w:t>Hi Vivek — your Bloomberg-for-Bharat vision is why I started NeuralQuant.</w:t>
         <w:br/>
         <w:br/>
-        <w:t>We built the reasoning layer that turns market data into defended conclusions: a quantified adversarial committee, regime-adaptive scoring, and an India-specific IRS% metric. Live at neuralquant.co, 949 tickers, 13/13 smoke tests passing.</w:t>
+        <w:t>We built the reasoning layer that turns market data into defended conclusions: a quantified adversarial committee, regime-adaptive scoring, and an India-specific IRS% metric. Live at neuralquant.co, 949 tickers, 15/15 smoke tests passing.</w:t>
         <w:br/>
         <w:br/>
         <w:t>I would welcome the chance to show you how it could sit inside StockEdge's existing SEBI RA/IA framework as a 12-month pilot — low risk, aligned incentives, and only an acquisition if your users actually pay for it.</w:t>
@@ -5308,7 +5198,7 @@
           <w:color w:val="121A24"/>
           <w:sz w:val="21"/>
         </w:rPr>
-        <w:t>Adversarial AI research engine — 12.69–14.83% alpha vs NIFTY50 — pilot proposal</w:t>
+        <w:t>Adversarial AI research engine — pilot proposal</w:t>
       </w:r>
     </w:p>
     <w:p>
@@ -5448,7 +5338,7 @@
                 <w:color w:val="121A24"/>
                 <w:sz w:val="20"/>
               </w:rPr>
-              <w:t>Live site, 949 tickers, 13/13 smoke tests, v4.1.0</w:t>
+              <w:t>Live site, 949 tickers, 15/15 smoke tests, v4.1.3</w:t>
             </w:r>
           </w:p>
         </w:tc>
@@ -5668,7 +5558,7 @@
                 <w:color w:val="121A24"/>
                 <w:sz w:val="20"/>
               </w:rPr>
-              <w:t>Backtest evidence: Q1FY27 alpha +12.69–14.83%, hit rate 87–91%</w:t>
+              <w:t>Methodology walkthrough and known limitations</w:t>
             </w:r>
           </w:p>
         </w:tc>
@@ -7185,7 +7075,7 @@
           <w:color w:val="121A24"/>
           <w:sz w:val="21"/>
         </w:rPr>
-        <w:t>13/13 smoke suite passing</w:t>
+        <w:t>15/15 smoke suite passing</w:t>
       </w:r>
     </w:p>
     <w:p>

</xml_diff>